<commit_message>
feat: puente del informe diagnostico EUDR hacia el indice IP/IV de ISCAM
- generar_tablas_informe_eudr.py: insumos externos para IP1/IP2/IP4 (PPA,
  SUNAT, Registro Sanitario), IV1 real (%FOB a la UE por pais de destino en
  Aduanas, excluyendo UK/Noruega), capa de confianza/triangulacion y mapa de
  cobertura de las 10 subdimensiones IP+IV. Corrige bug de clasificacion en
  la capa de confianza (organizaciones sin registro DUA).
- actualizar_docx_hacia_ipiv.py (nuevo): inyecta en el informe .docx las
  secciones 3.3, 4.9-4.11 (con 2 tablas nuevas) y addenda en 4.5/4.6/5/7,
  sin reescribir el contenido ya existente.
- informe_eudr_tablas.xlsx y el .docx regenerados con los hallazgos reales:
  Valle Grande y Asoc. San Martin (Tier 1, mayores exportadoras) sin Registro
  Sanitario vigente; dependencia UE real de 15% a 100% segun organizacion.
</commit_message>
<xml_diff>
--- a/reports/EUDR Café Perú — Diagnóstico Integrado (2).docx
+++ b/reports/EUDR Café Perú — Diagnóstico Integrado (2).docx
@@ -50,6 +50,9 @@
         </w:rPr>
         <w:t>- CIUP</w:t>
       </w:r>
+      <w:r>
+        <w:t xml:space="preserve"> (actualizado 9 oct. 2026)</w:t>
+      </w:r>
     </w:p>
     <w:p>
       <w:pPr>
@@ -92,6 +95,9 @@
         </w:rPr>
         <w:t xml:space="preserve"> Este documento caracteriza el nivel de preparación frente al Reglamento (UE) 2023/1115 sobre productos libres de deforestación (EUDR) de 25 organizaciones cafetaleras peruanas, a partir de su ficha técnica autorreportada a MIDAGRI. El registro real de Aduanas se emplea como fuente complementaria para verificar la confiabilidad de ese autorreporte, no como objeto de análisis en sí mismo. Se construye un índice de preparación a partir de cuatro dimensiones observables —avance EUDR autodeclarado, cobertura de certificaciones, formalidad tributaria y confiabilidad del autorreporte frente a Aduanas— que permite segmentar a las organizaciones en tres niveles. Ocho de las trece organizaciones exportadoras muestran preparación alta, cinco enfrentan riesgo de bloqueo documental por brechas en al menos una dimensión, y doce no reportan actividad exportadora directa. Se discuten las implicancias de esta segmentación para la priorización de asistencia técnica antes del plazo de diciembre de 2026.</w:t>
       </w:r>
+      <w:r>
+        <w:t xml:space="preserve"> Como ejercicio complementario, el documento evalúa en qué medida este índice administrativo se acerca a las diez subdimensiones del Índice de Preparación (IP) y el Índice de Vulnerabilidad (IV) que postula el equipo ISCAM, y qué tan factible es hoy construir cada una de ellas a partir de fuentes verificables distintas al autorreporte.</w:t>
+      </w:r>
     </w:p>
     <w:p>
       <w:pPr>
@@ -106,6 +112,9 @@
           <w:i/>
         </w:rPr>
         <w:t>Palabras clave: EUDR, preparación regulatoria, cadenas de valor cafetaleras, cooperativas, Perú.</w:t>
+      </w:r>
+      <w:r>
+        <w:t xml:space="preserve"> Índice de Preparación (IP), Índice de Vulnerabilidad (IV), ISCAM.</w:t>
       </w:r>
     </w:p>
     <w:p>
@@ -1134,6 +1143,31 @@
           <w:rFonts w:ascii="Arial" w:hAnsi="Arial" w:cs="Arial"/>
         </w:rPr>
         <w:t xml:space="preserve"> (no exporta directamente y, por tanto, no accede al régimen de declaración grupal que el reglamento habilita para organizaciones exportadoras). El umbral de 75% en el avance declarado y el de 10% en la divergencia frente a Aduanas son criterios de trabajo —no parámetros fijados por el propio reglamento—; la sección 6 discute esta limitación.</w:t>
+      </w:r>
+    </w:p>
+    <w:p>
+      <w:pPr>
+        <w:pStyle w:val="Ttulo3"/>
+        <w:spacing w:after="120"/>
+      </w:pPr>
+      <w:r>
+        <w:t>3.3 Relación con el Índice de Preparación (IP) y el Índice de Vulnerabilidad (IV) de ISCAM</w:t>
+      </w:r>
+    </w:p>
+    <w:p>
+      <w:pPr>
+        <w:spacing w:after="120"/>
+      </w:pPr>
+      <w:r>
+        <w:t>Este ejercicio no construye el IP ni el IV que postula el equipo ISCAM —esa arquitectura, de cinco subdimensiones separables por índice, requiere el Instrumento 2 aplicado a cooperativas reales, lo cual todavía no ha ocurrido—. Su propósito es doble: conocer a fondo estos 25 casos documentados por MIDAGRI, y obtener una primera idea, preliminar, de qué tan factible e idóneo resulta el instrumento frente a fuentes administrativas que sí existen hoy. El índice de cuatro criterios de la sección 3.2 es más grueso que IP —colapsa en un solo campo autodeclarado lo que IP separa en IP1 (trazabilidad/origen) e IP2 (cumplimiento ambiental/legal)— pero también más verificado, porque cruza Aduanas y SUNAT, fuentes que el Instrumento 2 todavía no tiene con qué contrastar en ningún caso real.</w:t>
+      </w:r>
+    </w:p>
+    <w:p>
+      <w:pPr>
+        <w:spacing w:after="120"/>
+      </w:pPr>
+      <w:r>
+        <w:t>Las secciones 4.9 a 4.11 retoman esta relación con tres piezas concretas: qué tan bien resiste la certificación autorreportada frente a la evidencia documental de Aduanas (4.9); qué tan dependiente es cada organización exportadora del mercado europeo específicamente, calculado con datos reales y no autorreportados (4.10, IV1); y un mapa de cobertura que documenta, subdimensión por subdimensión, cuánto de IP/IV es hoy verificable sin la encuesta y cuánto sigue dependiendo íntegramente de aplicarla (4.11).</w:t>
       </w:r>
     </w:p>
     <w:p>
@@ -3345,6 +3379,14 @@
     </w:p>
     <w:p>
       <w:pPr>
+        <w:spacing w:after="120"/>
+      </w:pPr>
+      <w:r>
+        <w:t>Este contraste FOB-vs-Aduanas no es, en rigor, una subdimensión de IP ni de IV: es el mecanismo de triangulación que el propio diseño de ISCAM exige como paso metodológico, sin que hasta ahora existiera una forma concreta de ejecutarlo. Al extenderlo a las dos variables de certificación (orgánica y Fairtrade, sección 4.9) y consolidarlo en un solo indicador por organización, resulta que 2 organizaciones —entre ellas Cooperativa Agraria Valle Grande, el mayor exportador de toda la muestra— divergen en las tres variables verificables a la vez, y 11 no tienen ninguna fuente externa con la que contrastar. Ser Tier 1 por los criterios de la sección 3.2 no implica, entonces, tener la confianza más alta en esta capa de triangulación: son dos lecturas distintas, y conviene reportarlas por separado en cualquier aplicación futura del índice.</w:t>
+      </w:r>
+    </w:p>
+    <w:p>
+      <w:pPr>
         <w:pStyle w:val="Ttulo3"/>
         <w:jc w:val="both"/>
         <w:rPr>
@@ -3372,6 +3414,14 @@
           <w:rFonts w:ascii="Arial" w:hAnsi="Arial" w:cs="Arial"/>
         </w:rPr>
         <w:t>Un último factor relevante para la preparación agregada del grupo, aunque no forma parte del índice individual, es la concentración operativa: diez de las trece organizaciones exportadoras despachan a través de un mismo agente de aduana (Grupo PML S.A.C.), y nueve lo hacen por el puerto de Paita. Esta concentración convierte a un solo intermediario logístico en un canal potencialmente eficiente para estandarizar, de forma centralizada, la recolección de evidencia documental EUDR para la mayor parte del grupo —independientemente del tier en que se encuentre cada organización.</w:t>
+      </w:r>
+    </w:p>
+    <w:p>
+      <w:pPr>
+        <w:spacing w:after="120"/>
+      </w:pPr>
+      <w:r>
+        <w:t>Esta señal no corresponde hoy a ninguna de las diez subdimensiones de IP/IV: es candidata a sumarse a IV5 (riesgo social y comercial), pero queda documentada como pendiente de una decisión de alcance explícita —el mismo criterio ya aplicado cuando se evaluó, y no se incorporó sin más, la pregunta de CLPI en Instrumento 7— antes de asumir que es un vacío que corresponde llenar automáticamente.</w:t>
       </w:r>
     </w:p>
     <w:p>
@@ -5376,6 +5426,1501 @@
     </w:p>
     <w:p>
       <w:pPr>
+        <w:pStyle w:val="Ttulo3"/>
+        <w:spacing w:after="120"/>
+      </w:pPr>
+      <w:r>
+        <w:t>4.9 Certificaciones: autorreporte vigente frente a evidencia documental en Aduanas</w:t>
+      </w:r>
+    </w:p>
+    <w:p>
+      <w:pPr>
+        <w:spacing w:after="120"/>
+      </w:pPr>
+      <w:r>
+        <w:t>El Art. 10(2) del Reglamento ya establece que las certificaciones voluntarias son información complementaria, no evidencia sustitutiva; esta sección cuantifica además cuánto rastro documental deja cada certificación en el expediente que un comprador europeo puede auditar directamente. De las 14 organizaciones con registro real en Aduanas, 14 declaran certificación Fairtrade vigente en su ficha MIDAGRI, pero solo 1 tiene la palabra 'fairtrade' en la descripción comercial de al menos un ítem de su propia Declaración de Aduanas (COCLA). La certificación orgánica deja un rastro más consistente, aunque tampoco pleno: 13 de 14 la declaran vigente y 9 tienen evidencia descriptiva en Aduanas.</w:t>
+      </w:r>
+    </w:p>
+    <w:p>
+      <w:pPr>
+        <w:spacing w:after="120"/>
+      </w:pPr>
+      <w:r>
+        <w:t>La lectura no es que las certificaciones sean falsas —la descripción comercial de una Declaración de Aduanas no está diseñada para documentar sellos de sostenibilidad, y su ausencia no prueba que el certificado no exista—. La lectura correcta es que el criterio cerrado de validación externa que ISCAM ya identificó ('Certificaciones') necesita, en la práctica, dos capas distintas: certificación autorreportada vigente, y evidencia documental en el expediente transaccional. Tratarlas como una sola señal sobreestimaría la confianza de cualquier verificación externa basada solo en Aduanas.</w:t>
+      </w:r>
+    </w:p>
+    <w:p>
+      <w:pPr>
+        <w:pStyle w:val="Ttulo3"/>
+        <w:spacing w:after="120"/>
+      </w:pPr>
+      <w:r>
+        <w:t>4.10 Dependencia real del mercado europeo (IV1)</w:t>
+      </w:r>
+    </w:p>
+    <w:p>
+      <w:pPr>
+        <w:spacing w:after="120"/>
+      </w:pPr>
+      <w:r>
+        <w:t>IV1 (dependencia del mercado europeo) requería, en el diseño original, una pregunta de encuesta sobre volumen total exportado a todos los destinos —el denominador que no estaba disponible—. Para las 14 organizaciones con registro real en Aduanas, ese denominador ya existe: cada Declaración Única de Aduana (DUA) trae un código de país de destino y un FOB propio, lo que permite calcular el porcentaje real del FOB exportado específicamente hacia la Unión Europea (27 miembros más Guadalupe, territorio aduanero de la UE; se excluye deliberadamente el Reino Unido, no miembro desde el Brexit, pese a ser uno de los destinos más frecuentes de la muestra).</w:t>
+      </w:r>
+    </w:p>
+    <w:p>
+      <w:pPr>
+        <w:spacing w:after="120"/>
+      </w:pPr>
+      <w:r>
+        <w:t>El resultado separa dos lecturas que el índice de la sección 3.2 no distingue. Tres organizaciones —Valle del Biavo, Villa Rica (CEMCAVIR) y Tropical Products— exportan el 100% de su FOB verificado hacia la UE: cualquier fricción EUDR las deja sin mercado alternativo inmediato. En el otro extremo, COCLA (20.3% hacia la UE) y La Florida (15.4%) son Tier 1 por preparación declarada, pero su exposición real a un bloqueo específicamente europeo es baja porque la mayor parte de su FOB ya se dirige a otros mercados (Japón, Estados Unidos). Esta es, en esencia, la lectura conjunta que el diseño IP×IV de ISCAM ya anticipaba: preparación alta y dependencia alta no son lo mismo, y solo la segunda determina cuánto duele, en términos comerciales, que la primera falle.</w:t>
+      </w:r>
+    </w:p>
+    <w:tbl>
+      <w:tblPr>
+        <w:tblStyle w:val="Tablaconcuadrcula"/>
+        <w:tblW w:type="auto" w:w="0"/>
+        <w:tblLook w:firstColumn="1" w:firstRow="1" w:lastColumn="0" w:lastRow="0" w:noHBand="0" w:noVBand="1" w:val="04A0"/>
+      </w:tblPr>
+      <w:tblGrid>
+        <w:gridCol w:w="1872"/>
+        <w:gridCol w:w="1872"/>
+        <w:gridCol w:w="1872"/>
+        <w:gridCol w:w="1872"/>
+        <w:gridCol w:w="1872"/>
+      </w:tblGrid>
+      <w:tr>
+        <w:tc>
+          <w:tcPr>
+            <w:tcW w:type="dxa" w:w="1872"/>
+          </w:tcPr>
+          <w:p>
+            <w:r>
+              <w:rPr>
+                <w:b/>
+              </w:rPr>
+              <w:t>Organización</w:t>
+            </w:r>
+          </w:p>
+        </w:tc>
+        <w:tc>
+          <w:tcPr>
+            <w:tcW w:type="dxa" w:w="1872"/>
+          </w:tcPr>
+          <w:p>
+            <w:r>
+              <w:rPr>
+                <w:b/>
+              </w:rPr>
+              <w:t>FOB real UE</w:t>
+            </w:r>
+          </w:p>
+        </w:tc>
+        <w:tc>
+          <w:tcPr>
+            <w:tcW w:type="dxa" w:w="1872"/>
+          </w:tcPr>
+          <w:p>
+            <w:r>
+              <w:rPr>
+                <w:b/>
+              </w:rPr>
+              <w:t>FOB real no-UE</w:t>
+            </w:r>
+          </w:p>
+        </w:tc>
+        <w:tc>
+          <w:tcPr>
+            <w:tcW w:type="dxa" w:w="1872"/>
+          </w:tcPr>
+          <w:p>
+            <w:r>
+              <w:rPr>
+                <w:b/>
+              </w:rPr>
+              <w:t>FOB real total</w:t>
+            </w:r>
+          </w:p>
+        </w:tc>
+        <w:tc>
+          <w:tcPr>
+            <w:tcW w:type="dxa" w:w="1872"/>
+          </w:tcPr>
+          <w:p>
+            <w:r>
+              <w:rPr>
+                <w:b/>
+              </w:rPr>
+              <w:t>% hacia la UE</w:t>
+            </w:r>
+          </w:p>
+        </w:tc>
+      </w:tr>
+      <w:tr>
+        <w:tc>
+          <w:tcPr>
+            <w:tcW w:type="dxa" w:w="1872"/>
+          </w:tcPr>
+          <w:p>
+            <w:r>
+              <w:t>Cooperativa Agraria Valle Grande</w:t>
+            </w:r>
+          </w:p>
+        </w:tc>
+        <w:tc>
+          <w:tcPr>
+            <w:tcW w:type="dxa" w:w="1872"/>
+          </w:tcPr>
+          <w:p>
+            <w:r>
+              <w:t>US$ 7,878,142</w:t>
+            </w:r>
+          </w:p>
+        </w:tc>
+        <w:tc>
+          <w:tcPr>
+            <w:tcW w:type="dxa" w:w="1872"/>
+          </w:tcPr>
+          <w:p>
+            <w:r>
+              <w:t>US$ 3,843,267</w:t>
+            </w:r>
+          </w:p>
+        </w:tc>
+        <w:tc>
+          <w:tcPr>
+            <w:tcW w:type="dxa" w:w="1872"/>
+          </w:tcPr>
+          <w:p>
+            <w:r>
+              <w:t>US$ 11,721,409</w:t>
+            </w:r>
+          </w:p>
+        </w:tc>
+        <w:tc>
+          <w:tcPr>
+            <w:tcW w:type="dxa" w:w="1872"/>
+          </w:tcPr>
+          <w:p>
+            <w:r>
+              <w:t>67.2%</w:t>
+            </w:r>
+          </w:p>
+        </w:tc>
+      </w:tr>
+      <w:tr>
+        <w:tc>
+          <w:tcPr>
+            <w:tcW w:type="dxa" w:w="1872"/>
+          </w:tcPr>
+          <w:p>
+            <w:r>
+              <w:t>Asociación Agroexportadora de la Región San Martín</w:t>
+            </w:r>
+          </w:p>
+        </w:tc>
+        <w:tc>
+          <w:tcPr>
+            <w:tcW w:type="dxa" w:w="1872"/>
+          </w:tcPr>
+          <w:p>
+            <w:r>
+              <w:t>US$ 4,575,551</w:t>
+            </w:r>
+          </w:p>
+        </w:tc>
+        <w:tc>
+          <w:tcPr>
+            <w:tcW w:type="dxa" w:w="1872"/>
+          </w:tcPr>
+          <w:p>
+            <w:r>
+              <w:t>US$ 2,111,310</w:t>
+            </w:r>
+          </w:p>
+        </w:tc>
+        <w:tc>
+          <w:tcPr>
+            <w:tcW w:type="dxa" w:w="1872"/>
+          </w:tcPr>
+          <w:p>
+            <w:r>
+              <w:t>US$ 6,686,862</w:t>
+            </w:r>
+          </w:p>
+        </w:tc>
+        <w:tc>
+          <w:tcPr>
+            <w:tcW w:type="dxa" w:w="1872"/>
+          </w:tcPr>
+          <w:p>
+            <w:r>
+              <w:t>68.4%</w:t>
+            </w:r>
+          </w:p>
+        </w:tc>
+      </w:tr>
+      <w:tr>
+        <w:tc>
+          <w:tcPr>
+            <w:tcW w:type="dxa" w:w="1872"/>
+          </w:tcPr>
+          <w:p>
+            <w:r>
+              <w:t>Cooperativa Agraria Cafetalera CASIL LTDA</w:t>
+            </w:r>
+          </w:p>
+        </w:tc>
+        <w:tc>
+          <w:tcPr>
+            <w:tcW w:type="dxa" w:w="1872"/>
+          </w:tcPr>
+          <w:p>
+            <w:r>
+              <w:t>US$ 965,167</w:t>
+            </w:r>
+          </w:p>
+        </w:tc>
+        <w:tc>
+          <w:tcPr>
+            <w:tcW w:type="dxa" w:w="1872"/>
+          </w:tcPr>
+          <w:p>
+            <w:r>
+              <w:t>US$ 3,503,412</w:t>
+            </w:r>
+          </w:p>
+        </w:tc>
+        <w:tc>
+          <w:tcPr>
+            <w:tcW w:type="dxa" w:w="1872"/>
+          </w:tcPr>
+          <w:p>
+            <w:r>
+              <w:t>US$ 4,468,579</w:t>
+            </w:r>
+          </w:p>
+        </w:tc>
+        <w:tc>
+          <w:tcPr>
+            <w:tcW w:type="dxa" w:w="1872"/>
+          </w:tcPr>
+          <w:p>
+            <w:r>
+              <w:t>21.6%</w:t>
+            </w:r>
+          </w:p>
+        </w:tc>
+      </w:tr>
+      <w:tr>
+        <w:tc>
+          <w:tcPr>
+            <w:tcW w:type="dxa" w:w="1872"/>
+          </w:tcPr>
+          <w:p>
+            <w:r>
+              <w:t>Central de Cooperativas Agrarias Cafetaleras Cocla Ltda. Nro 281</w:t>
+            </w:r>
+          </w:p>
+        </w:tc>
+        <w:tc>
+          <w:tcPr>
+            <w:tcW w:type="dxa" w:w="1872"/>
+          </w:tcPr>
+          <w:p>
+            <w:r>
+              <w:t>US$ 894,391</w:t>
+            </w:r>
+          </w:p>
+        </w:tc>
+        <w:tc>
+          <w:tcPr>
+            <w:tcW w:type="dxa" w:w="1872"/>
+          </w:tcPr>
+          <w:p>
+            <w:r>
+              <w:t>US$ 3,521,220</w:t>
+            </w:r>
+          </w:p>
+        </w:tc>
+        <w:tc>
+          <w:tcPr>
+            <w:tcW w:type="dxa" w:w="1872"/>
+          </w:tcPr>
+          <w:p>
+            <w:r>
+              <w:t>US$ 4,415,612</w:t>
+            </w:r>
+          </w:p>
+        </w:tc>
+        <w:tc>
+          <w:tcPr>
+            <w:tcW w:type="dxa" w:w="1872"/>
+          </w:tcPr>
+          <w:p>
+            <w:r>
+              <w:t>20.3%</w:t>
+            </w:r>
+          </w:p>
+        </w:tc>
+      </w:tr>
+      <w:tr>
+        <w:tc>
+          <w:tcPr>
+            <w:tcW w:type="dxa" w:w="1872"/>
+          </w:tcPr>
+          <w:p>
+            <w:r>
+              <w:t>Cooperativa Agraria Cafetalera la Florida</w:t>
+            </w:r>
+          </w:p>
+        </w:tc>
+        <w:tc>
+          <w:tcPr>
+            <w:tcW w:type="dxa" w:w="1872"/>
+          </w:tcPr>
+          <w:p>
+            <w:r>
+              <w:t>US$ 644,581</w:t>
+            </w:r>
+          </w:p>
+        </w:tc>
+        <w:tc>
+          <w:tcPr>
+            <w:tcW w:type="dxa" w:w="1872"/>
+          </w:tcPr>
+          <w:p>
+            <w:r>
+              <w:t>US$ 3,540,141</w:t>
+            </w:r>
+          </w:p>
+        </w:tc>
+        <w:tc>
+          <w:tcPr>
+            <w:tcW w:type="dxa" w:w="1872"/>
+          </w:tcPr>
+          <w:p>
+            <w:r>
+              <w:t>US$ 4,184,722</w:t>
+            </w:r>
+          </w:p>
+        </w:tc>
+        <w:tc>
+          <w:tcPr>
+            <w:tcW w:type="dxa" w:w="1872"/>
+          </w:tcPr>
+          <w:p>
+            <w:r>
+              <w:t>15.4%</w:t>
+            </w:r>
+          </w:p>
+        </w:tc>
+      </w:tr>
+      <w:tr>
+        <w:tc>
+          <w:tcPr>
+            <w:tcW w:type="dxa" w:w="1872"/>
+          </w:tcPr>
+          <w:p>
+            <w:r>
+              <w:t>Asociación de Productores Selva Nororiental - APROSELVANOR</w:t>
+            </w:r>
+          </w:p>
+        </w:tc>
+        <w:tc>
+          <w:tcPr>
+            <w:tcW w:type="dxa" w:w="1872"/>
+          </w:tcPr>
+          <w:p>
+            <w:r>
+              <w:t>US$ 2,059,444</w:t>
+            </w:r>
+          </w:p>
+        </w:tc>
+        <w:tc>
+          <w:tcPr>
+            <w:tcW w:type="dxa" w:w="1872"/>
+          </w:tcPr>
+          <w:p>
+            <w:r>
+              <w:t>US$ 2,095,124</w:t>
+            </w:r>
+          </w:p>
+        </w:tc>
+        <w:tc>
+          <w:tcPr>
+            <w:tcW w:type="dxa" w:w="1872"/>
+          </w:tcPr>
+          <w:p>
+            <w:r>
+              <w:t>US$ 4,154,568</w:t>
+            </w:r>
+          </w:p>
+        </w:tc>
+        <w:tc>
+          <w:tcPr>
+            <w:tcW w:type="dxa" w:w="1872"/>
+          </w:tcPr>
+          <w:p>
+            <w:r>
+              <w:t>49.6%</w:t>
+            </w:r>
+          </w:p>
+        </w:tc>
+      </w:tr>
+      <w:tr>
+        <w:tc>
+          <w:tcPr>
+            <w:tcW w:type="dxa" w:w="1872"/>
+          </w:tcPr>
+          <w:p>
+            <w:r>
+              <w:t>Cooperativa Agraria de Servicios Múltiples Cordillera Azul</w:t>
+            </w:r>
+          </w:p>
+        </w:tc>
+        <w:tc>
+          <w:tcPr>
+            <w:tcW w:type="dxa" w:w="1872"/>
+          </w:tcPr>
+          <w:p>
+            <w:r>
+              <w:t>US$ 852,880</w:t>
+            </w:r>
+          </w:p>
+        </w:tc>
+        <w:tc>
+          <w:tcPr>
+            <w:tcW w:type="dxa" w:w="1872"/>
+          </w:tcPr>
+          <w:p>
+            <w:r>
+              <w:t>US$ 348,246</w:t>
+            </w:r>
+          </w:p>
+        </w:tc>
+        <w:tc>
+          <w:tcPr>
+            <w:tcW w:type="dxa" w:w="1872"/>
+          </w:tcPr>
+          <w:p>
+            <w:r>
+              <w:t>US$ 1,201,127</w:t>
+            </w:r>
+          </w:p>
+        </w:tc>
+        <w:tc>
+          <w:tcPr>
+            <w:tcW w:type="dxa" w:w="1872"/>
+          </w:tcPr>
+          <w:p>
+            <w:r>
+              <w:t>71.0%</w:t>
+            </w:r>
+          </w:p>
+        </w:tc>
+      </w:tr>
+      <w:tr>
+        <w:tc>
+          <w:tcPr>
+            <w:tcW w:type="dxa" w:w="1872"/>
+          </w:tcPr>
+          <w:p>
+            <w:r>
+              <w:t>Cooperativa Agraria Valle del Biavo Ltda</w:t>
+            </w:r>
+          </w:p>
+        </w:tc>
+        <w:tc>
+          <w:tcPr>
+            <w:tcW w:type="dxa" w:w="1872"/>
+          </w:tcPr>
+          <w:p>
+            <w:r>
+              <w:t>US$ 1,187,600</w:t>
+            </w:r>
+          </w:p>
+        </w:tc>
+        <w:tc>
+          <w:tcPr>
+            <w:tcW w:type="dxa" w:w="1872"/>
+          </w:tcPr>
+          <w:p>
+            <w:r>
+              <w:t>US$ 0</w:t>
+            </w:r>
+          </w:p>
+        </w:tc>
+        <w:tc>
+          <w:tcPr>
+            <w:tcW w:type="dxa" w:w="1872"/>
+          </w:tcPr>
+          <w:p>
+            <w:r>
+              <w:t>US$ 1,187,600</w:t>
+            </w:r>
+          </w:p>
+        </w:tc>
+        <w:tc>
+          <w:tcPr>
+            <w:tcW w:type="dxa" w:w="1872"/>
+          </w:tcPr>
+          <w:p>
+            <w:r>
+              <w:t>100.0%</w:t>
+            </w:r>
+          </w:p>
+        </w:tc>
+      </w:tr>
+      <w:tr>
+        <w:tc>
+          <w:tcPr>
+            <w:tcW w:type="dxa" w:w="1872"/>
+          </w:tcPr>
+          <w:p>
+            <w:r>
+              <w:t>Asociación de Productores Cerro Blanco</w:t>
+            </w:r>
+          </w:p>
+        </w:tc>
+        <w:tc>
+          <w:tcPr>
+            <w:tcW w:type="dxa" w:w="1872"/>
+          </w:tcPr>
+          <w:p>
+            <w:r>
+              <w:t>US$ 76,135</w:t>
+            </w:r>
+          </w:p>
+        </w:tc>
+        <w:tc>
+          <w:tcPr>
+            <w:tcW w:type="dxa" w:w="1872"/>
+          </w:tcPr>
+          <w:p>
+            <w:r>
+              <w:t>US$ 864,648</w:t>
+            </w:r>
+          </w:p>
+        </w:tc>
+        <w:tc>
+          <w:tcPr>
+            <w:tcW w:type="dxa" w:w="1872"/>
+          </w:tcPr>
+          <w:p>
+            <w:r>
+              <w:t>US$ 940,783</w:t>
+            </w:r>
+          </w:p>
+        </w:tc>
+        <w:tc>
+          <w:tcPr>
+            <w:tcW w:type="dxa" w:w="1872"/>
+          </w:tcPr>
+          <w:p>
+            <w:r>
+              <w:t>8.1%</w:t>
+            </w:r>
+          </w:p>
+        </w:tc>
+      </w:tr>
+      <w:tr>
+        <w:tc>
+          <w:tcPr>
+            <w:tcW w:type="dxa" w:w="1872"/>
+          </w:tcPr>
+          <w:p>
+            <w:r>
+              <w:t>Cooperativa Agraria Ecológica De Mujeres Cafetaleras Villa Rica</w:t>
+            </w:r>
+          </w:p>
+        </w:tc>
+        <w:tc>
+          <w:tcPr>
+            <w:tcW w:type="dxa" w:w="1872"/>
+          </w:tcPr>
+          <w:p>
+            <w:r>
+              <w:t>US$ 813,480</w:t>
+            </w:r>
+          </w:p>
+        </w:tc>
+        <w:tc>
+          <w:tcPr>
+            <w:tcW w:type="dxa" w:w="1872"/>
+          </w:tcPr>
+          <w:p>
+            <w:r>
+              <w:t>US$ 0</w:t>
+            </w:r>
+          </w:p>
+        </w:tc>
+        <w:tc>
+          <w:tcPr>
+            <w:tcW w:type="dxa" w:w="1872"/>
+          </w:tcPr>
+          <w:p>
+            <w:r>
+              <w:t>US$ 813,480</w:t>
+            </w:r>
+          </w:p>
+        </w:tc>
+        <w:tc>
+          <w:tcPr>
+            <w:tcW w:type="dxa" w:w="1872"/>
+          </w:tcPr>
+          <w:p>
+            <w:r>
+              <w:t>100.0%</w:t>
+            </w:r>
+          </w:p>
+        </w:tc>
+      </w:tr>
+      <w:tr>
+        <w:tc>
+          <w:tcPr>
+            <w:tcW w:type="dxa" w:w="1872"/>
+          </w:tcPr>
+          <w:p>
+            <w:r>
+              <w:t>Cooperativa Agraria Cafetalera OCUMAL</w:t>
+            </w:r>
+          </w:p>
+        </w:tc>
+        <w:tc>
+          <w:tcPr>
+            <w:tcW w:type="dxa" w:w="1872"/>
+          </w:tcPr>
+          <w:p>
+            <w:r>
+              <w:t>US$ 0</w:t>
+            </w:r>
+          </w:p>
+        </w:tc>
+        <w:tc>
+          <w:tcPr>
+            <w:tcW w:type="dxa" w:w="1872"/>
+          </w:tcPr>
+          <w:p>
+            <w:r>
+              <w:t>US$ 442,439</w:t>
+            </w:r>
+          </w:p>
+        </w:tc>
+        <w:tc>
+          <w:tcPr>
+            <w:tcW w:type="dxa" w:w="1872"/>
+          </w:tcPr>
+          <w:p>
+            <w:r>
+              <w:t>US$ 442,439</w:t>
+            </w:r>
+          </w:p>
+        </w:tc>
+        <w:tc>
+          <w:tcPr>
+            <w:tcW w:type="dxa" w:w="1872"/>
+          </w:tcPr>
+          <w:p>
+            <w:r>
+              <w:t>0.0%</w:t>
+            </w:r>
+          </w:p>
+        </w:tc>
+      </w:tr>
+      <w:tr>
+        <w:tc>
+          <w:tcPr>
+            <w:tcW w:type="dxa" w:w="1872"/>
+          </w:tcPr>
+          <w:p>
+            <w:r>
+              <w:t>Cooperativa Agria Tropical Products</w:t>
+            </w:r>
+          </w:p>
+        </w:tc>
+        <w:tc>
+          <w:tcPr>
+            <w:tcW w:type="dxa" w:w="1872"/>
+          </w:tcPr>
+          <w:p>
+            <w:r>
+              <w:t>US$ 332,555</w:t>
+            </w:r>
+          </w:p>
+        </w:tc>
+        <w:tc>
+          <w:tcPr>
+            <w:tcW w:type="dxa" w:w="1872"/>
+          </w:tcPr>
+          <w:p>
+            <w:r>
+              <w:t>US$ 0</w:t>
+            </w:r>
+          </w:p>
+        </w:tc>
+        <w:tc>
+          <w:tcPr>
+            <w:tcW w:type="dxa" w:w="1872"/>
+          </w:tcPr>
+          <w:p>
+            <w:r>
+              <w:t>US$ 332,555</w:t>
+            </w:r>
+          </w:p>
+        </w:tc>
+        <w:tc>
+          <w:tcPr>
+            <w:tcW w:type="dxa" w:w="1872"/>
+          </w:tcPr>
+          <w:p>
+            <w:r>
+              <w:t>100.0%</w:t>
+            </w:r>
+          </w:p>
+        </w:tc>
+      </w:tr>
+      <w:tr>
+        <w:tc>
+          <w:tcPr>
+            <w:tcW w:type="dxa" w:w="1872"/>
+          </w:tcPr>
+          <w:p>
+            <w:r>
+              <w:t>Cooperativa Agraria de Productores Ecológicos los Chankas Valle del Río Perené</w:t>
+            </w:r>
+          </w:p>
+        </w:tc>
+        <w:tc>
+          <w:tcPr>
+            <w:tcW w:type="dxa" w:w="1872"/>
+          </w:tcPr>
+          <w:p>
+            <w:r>
+              <w:t>US$ 0</w:t>
+            </w:r>
+          </w:p>
+        </w:tc>
+        <w:tc>
+          <w:tcPr>
+            <w:tcW w:type="dxa" w:w="1872"/>
+          </w:tcPr>
+          <w:p>
+            <w:r>
+              <w:t>US$ 147,669</w:t>
+            </w:r>
+          </w:p>
+        </w:tc>
+        <w:tc>
+          <w:tcPr>
+            <w:tcW w:type="dxa" w:w="1872"/>
+          </w:tcPr>
+          <w:p>
+            <w:r>
+              <w:t>US$ 147,669</w:t>
+            </w:r>
+          </w:p>
+        </w:tc>
+        <w:tc>
+          <w:tcPr>
+            <w:tcW w:type="dxa" w:w="1872"/>
+          </w:tcPr>
+          <w:p>
+            <w:r>
+              <w:t>0.0%</w:t>
+            </w:r>
+          </w:p>
+        </w:tc>
+      </w:tr>
+      <w:tr>
+        <w:tc>
+          <w:tcPr>
+            <w:tcW w:type="dxa" w:w="1872"/>
+          </w:tcPr>
+          <w:p>
+            <w:r>
+              <w:t>Asociación de Productores Agroecológicos San Juan - APROCASJ</w:t>
+            </w:r>
+          </w:p>
+        </w:tc>
+        <w:tc>
+          <w:tcPr>
+            <w:tcW w:type="dxa" w:w="1872"/>
+          </w:tcPr>
+          <w:p>
+            <w:r>
+              <w:t>US$ 0</w:t>
+            </w:r>
+          </w:p>
+        </w:tc>
+        <w:tc>
+          <w:tcPr>
+            <w:tcW w:type="dxa" w:w="1872"/>
+          </w:tcPr>
+          <w:p>
+            <w:r>
+              <w:t>US$ 7,275</w:t>
+            </w:r>
+          </w:p>
+        </w:tc>
+        <w:tc>
+          <w:tcPr>
+            <w:tcW w:type="dxa" w:w="1872"/>
+          </w:tcPr>
+          <w:p>
+            <w:r>
+              <w:t>US$ 7,275</w:t>
+            </w:r>
+          </w:p>
+        </w:tc>
+        <w:tc>
+          <w:tcPr>
+            <w:tcW w:type="dxa" w:w="1872"/>
+          </w:tcPr>
+          <w:p>
+            <w:r>
+              <w:t>0.0%</w:t>
+            </w:r>
+          </w:p>
+        </w:tc>
+      </w:tr>
+    </w:tbl>
+    <w:p/>
+    <w:p>
+      <w:pPr>
+        <w:spacing w:after="120"/>
+      </w:pPr>
+      <w:r>
+        <w:t>Para las 11 organizaciones restantes, sin registro DUA, IV1 sigue dependiendo íntegramente de la pregunta P1b ya diseñada para Instrumento 2 — este dato administrativo no las cubre.</w:t>
+      </w:r>
+    </w:p>
+    <w:p>
+      <w:pPr>
+        <w:pStyle w:val="Ttulo3"/>
+        <w:spacing w:after="120"/>
+      </w:pPr>
+      <w:r>
+        <w:t>4.11 Mapa de cobertura hacia el índice IP/IV de ISCAM</w:t>
+      </w:r>
+    </w:p>
+    <w:p>
+      <w:pPr>
+        <w:spacing w:after="120"/>
+      </w:pPr>
+      <w:r>
+        <w:t>La pieza más directamente útil de este ejercicio para evaluar la factibilidad del instrumento es esta: de las diez subdimensiones que ISCAM postula (cinco de IP, cinco de IV), ¿cuántas se pueden acotar hoy con fuentes administrativas verificables, sin esperar a aplicar la encuesta? Un ejemplo concreto ilustra el tipo de hallazgo que esta cobertura permite: 7 de las 25 organizaciones no tienen ningún Registro Sanitario vigente, y dos de ellas —Cooperativa Agraria Valle Grande y Asociación Agroexportadora de la Región San Martín— son, precisamente, los dos mayores exportadores de la muestra y Tier 1 por los criterios de la sección 3.2. Es exactamente el mismo patrón ya documentado para la vigencia de mandatos en la sección 4.8: una brecha documental real que el índice de cuatro criterios no observa porque no la mide, no porque no exista.</w:t>
+      </w:r>
+    </w:p>
+    <w:tbl>
+      <w:tblPr>
+        <w:tblStyle w:val="Tablaconcuadrcula"/>
+        <w:tblW w:type="auto" w:w="0"/>
+        <w:tblLook w:firstColumn="1" w:firstRow="1" w:lastColumn="0" w:lastRow="0" w:noHBand="0" w:noVBand="1" w:val="04A0"/>
+      </w:tblPr>
+      <w:tblGrid>
+        <w:gridCol w:w="1872"/>
+        <w:gridCol w:w="1872"/>
+        <w:gridCol w:w="1872"/>
+        <w:gridCol w:w="1872"/>
+        <w:gridCol w:w="1872"/>
+      </w:tblGrid>
+      <w:tr>
+        <w:tc>
+          <w:tcPr>
+            <w:tcW w:type="dxa" w:w="1872"/>
+          </w:tcPr>
+          <w:p>
+            <w:r>
+              <w:rPr>
+                <w:b/>
+              </w:rPr>
+              <w:t>Índice</w:t>
+            </w:r>
+          </w:p>
+        </w:tc>
+        <w:tc>
+          <w:tcPr>
+            <w:tcW w:type="dxa" w:w="1872"/>
+          </w:tcPr>
+          <w:p>
+            <w:r>
+              <w:rPr>
+                <w:b/>
+              </w:rPr>
+              <w:t>Subdimensión</w:t>
+            </w:r>
+          </w:p>
+        </w:tc>
+        <w:tc>
+          <w:tcPr>
+            <w:tcW w:type="dxa" w:w="1872"/>
+          </w:tcPr>
+          <w:p>
+            <w:r>
+              <w:rPr>
+                <w:b/>
+              </w:rPr>
+              <w:t>Cobertura hoy</w:t>
+            </w:r>
+          </w:p>
+        </w:tc>
+        <w:tc>
+          <w:tcPr>
+            <w:tcW w:type="dxa" w:w="1872"/>
+          </w:tcPr>
+          <w:p>
+            <w:r>
+              <w:rPr>
+                <w:b/>
+              </w:rPr>
+              <w:t>Fuente externa disponible</w:t>
+            </w:r>
+          </w:p>
+        </w:tc>
+        <w:tc>
+          <w:tcPr>
+            <w:tcW w:type="dxa" w:w="1872"/>
+          </w:tcPr>
+          <w:p>
+            <w:r>
+              <w:rPr>
+                <w:b/>
+              </w:rPr>
+              <w:t>Pendiente de Instrumento 2</w:t>
+            </w:r>
+          </w:p>
+        </w:tc>
+      </w:tr>
+      <w:tr>
+        <w:tc>
+          <w:tcPr>
+            <w:tcW w:type="dxa" w:w="1872"/>
+          </w:tcPr>
+          <w:p>
+            <w:r>
+              <w:t>IP1</w:t>
+            </w:r>
+          </w:p>
+        </w:tc>
+        <w:tc>
+          <w:tcPr>
+            <w:tcW w:type="dxa" w:w="1872"/>
+          </w:tcPr>
+          <w:p>
+            <w:r>
+              <w:t>Trazabilidad y origen</w:t>
+            </w:r>
+          </w:p>
+        </w:tc>
+        <w:tc>
+          <w:tcPr>
+            <w:tcW w:type="dxa" w:w="1872"/>
+          </w:tcPr>
+          <w:p>
+            <w:r>
+              <w:t>Parcial</w:t>
+            </w:r>
+          </w:p>
+        </w:tc>
+        <w:tc>
+          <w:tcPr>
+            <w:tcW w:type="dxa" w:w="1872"/>
+          </w:tcPr>
+          <w:p>
+            <w:r>
+              <w:t>PPA (inscripción organizacional, Art. 9); ítem lote/ICO en Aduanas (trazabilidad comercial, no de parcela)</w:t>
+            </w:r>
+          </w:p>
+        </w:tc>
+        <w:tc>
+          <w:tcPr>
+            <w:tcW w:type="dxa" w:w="1872"/>
+          </w:tcPr>
+          <w:p>
+            <w:r>
+              <w:t>Verificación a nivel de parcela/socio individual — solo vía Instrumento 2</w:t>
+            </w:r>
+          </w:p>
+        </w:tc>
+      </w:tr>
+      <w:tr>
+        <w:tc>
+          <w:tcPr>
+            <w:tcW w:type="dxa" w:w="1872"/>
+          </w:tcPr>
+          <w:p>
+            <w:r>
+              <w:t>IP2</w:t>
+            </w:r>
+          </w:p>
+        </w:tc>
+        <w:tc>
+          <w:tcPr>
+            <w:tcW w:type="dxa" w:w="1872"/>
+          </w:tcPr>
+          <w:p>
+            <w:r>
+              <w:t>Cumplimiento ambiental/legal</w:t>
+            </w:r>
+          </w:p>
+        </w:tc>
+        <w:tc>
+          <w:tcPr>
+            <w:tcW w:type="dxa" w:w="1872"/>
+          </w:tcPr>
+          <w:p>
+            <w:r>
+              <w:t>Fuerte (solo componente tributario)</w:t>
+            </w:r>
+          </w:p>
+        </w:tc>
+        <w:tc>
+          <w:tcPr>
+            <w:tcW w:type="dxa" w:w="1872"/>
+          </w:tcPr>
+          <w:p>
+            <w:r>
+              <w:t>Estado y condición del contribuyente ante SUNAT</w:t>
+            </w:r>
+          </w:p>
+        </w:tc>
+        <w:tc>
+          <w:tcPr>
+            <w:tcW w:type="dxa" w:w="1872"/>
+          </w:tcPr>
+          <w:p>
+            <w:r>
+              <w:t>Evidencia de título de tierra y normativa ambiental de fondo — ninguna fuente administrativa disponible la cubre</w:t>
+            </w:r>
+          </w:p>
+        </w:tc>
+      </w:tr>
+      <w:tr>
+        <w:tc>
+          <w:tcPr>
+            <w:tcW w:type="dxa" w:w="1872"/>
+          </w:tcPr>
+          <w:p>
+            <w:r>
+              <w:t>IP3</w:t>
+            </w:r>
+          </w:p>
+        </w:tc>
+        <w:tc>
+          <w:tcPr>
+            <w:tcW w:type="dxa" w:w="1872"/>
+          </w:tcPr>
+          <w:p>
+            <w:r>
+              <w:t>Capacidades organizacionales</w:t>
+            </w:r>
+          </w:p>
+        </w:tc>
+        <w:tc>
+          <w:tcPr>
+            <w:tcW w:type="dxa" w:w="1872"/>
+          </w:tcPr>
+          <w:p>
+            <w:r>
+              <w:t>Parcial</w:t>
+            </w:r>
+          </w:p>
+        </w:tc>
+        <w:tc>
+          <w:tcPr>
+            <w:tcW w:type="dxa" w:w="1872"/>
+          </w:tcPr>
+          <w:p>
+            <w:r>
+              <w:t>Asistencias técnicas y talleres MIDAGRI 2020–2025; etapa del PAC</w:t>
+            </w:r>
+          </w:p>
+        </w:tc>
+        <w:tc>
+          <w:tcPr>
+            <w:tcW w:type="dxa" w:w="1872"/>
+          </w:tcPr>
+          <w:p>
+            <w:r>
+              <w:t>Política formal de debida diligencia (D5) y percepción de fricción/costos (D8) — solo Instrumento 2</w:t>
+            </w:r>
+          </w:p>
+        </w:tc>
+      </w:tr>
+      <w:tr>
+        <w:tc>
+          <w:tcPr>
+            <w:tcW w:type="dxa" w:w="1872"/>
+          </w:tcPr>
+          <w:p>
+            <w:r>
+              <w:t>IP4</w:t>
+            </w:r>
+          </w:p>
+        </w:tc>
+        <w:tc>
+          <w:tcPr>
+            <w:tcW w:type="dxa" w:w="1872"/>
+          </w:tcPr>
+          <w:p>
+            <w:r>
+              <w:t>Información y documentación</w:t>
+            </w:r>
+          </w:p>
+        </w:tc>
+        <w:tc>
+          <w:tcPr>
+            <w:tcW w:type="dxa" w:w="1872"/>
+          </w:tcPr>
+          <w:p>
+            <w:r>
+              <w:t>Parcial, reforzada en esta ronda</w:t>
+            </w:r>
+          </w:p>
+        </w:tc>
+        <w:tc>
+          <w:tcPr>
+            <w:tcW w:type="dxa" w:w="1872"/>
+          </w:tcPr>
+          <w:p>
+            <w:r>
+              <w:t>Registro Sanitario y su vencimiento; antigüedad de mandato OECE (bandera, no se promedia)</w:t>
+            </w:r>
+          </w:p>
+        </w:tc>
+        <w:tc>
+          <w:tcPr>
+            <w:tcW w:type="dxa" w:w="1872"/>
+          </w:tcPr>
+          <w:p>
+            <w:r>
+              <w:t>Resto del expediente documental EUDR (DDS, mapas, contratos de abastecimiento) — solo Instrumento 2</w:t>
+            </w:r>
+          </w:p>
+        </w:tc>
+      </w:tr>
+      <w:tr>
+        <w:tc>
+          <w:tcPr>
+            <w:tcW w:type="dxa" w:w="1872"/>
+          </w:tcPr>
+          <w:p>
+            <w:r>
+              <w:t>IP5</w:t>
+            </w:r>
+          </w:p>
+        </w:tc>
+        <w:tc>
+          <w:tcPr>
+            <w:tcW w:type="dxa" w:w="1872"/>
+          </w:tcPr>
+          <w:p>
+            <w:r>
+              <w:t>Adaptación y acceso a recursos</w:t>
+            </w:r>
+          </w:p>
+        </w:tc>
+        <w:tc>
+          <w:tcPr>
+            <w:tcW w:type="dxa" w:w="1872"/>
+          </w:tcPr>
+          <w:p>
+            <w:r>
+              <w:t>Ninguna</w:t>
+            </w:r>
+          </w:p>
+        </w:tc>
+        <w:tc>
+          <w:tcPr>
+            <w:tcW w:type="dxa" w:w="1872"/>
+          </w:tcPr>
+          <w:p>
+            <w:r>
+              <w:t>—</w:t>
+            </w:r>
+          </w:p>
+        </w:tc>
+        <w:tc>
+          <w:tcPr>
+            <w:tcW w:type="dxa" w:w="1872"/>
+          </w:tcPr>
+          <w:p>
+            <w:r>
+              <w:t>Financiamiento, costos de cumplimiento, acceso a crédito — íntegramente Instrumento 2</w:t>
+            </w:r>
+          </w:p>
+        </w:tc>
+      </w:tr>
+      <w:tr>
+        <w:tc>
+          <w:tcPr>
+            <w:tcW w:type="dxa" w:w="1872"/>
+          </w:tcPr>
+          <w:p>
+            <w:r>
+              <w:t>IV1</w:t>
+            </w:r>
+          </w:p>
+        </w:tc>
+        <w:tc>
+          <w:tcPr>
+            <w:tcW w:type="dxa" w:w="1872"/>
+          </w:tcPr>
+          <w:p>
+            <w:r>
+              <w:t>Dependencia del mercado europeo</w:t>
+            </w:r>
+          </w:p>
+        </w:tc>
+        <w:tc>
+          <w:tcPr>
+            <w:tcW w:type="dxa" w:w="1872"/>
+          </w:tcPr>
+          <w:p>
+            <w:r>
+              <w:t>Fuerte, solo para 14 de 25 organizaciones</w:t>
+            </w:r>
+          </w:p>
+        </w:tc>
+        <w:tc>
+          <w:tcPr>
+            <w:tcW w:type="dxa" w:w="1872"/>
+          </w:tcPr>
+          <w:p>
+            <w:r>
+              <w:t>Ratio FOB UE / FOB total calculado directamente de Aduanas (pais_codigo por DUA)</w:t>
+            </w:r>
+          </w:p>
+        </w:tc>
+        <w:tc>
+          <w:tcPr>
+            <w:tcW w:type="dxa" w:w="1872"/>
+          </w:tcPr>
+          <w:p>
+            <w:r>
+              <w:t>Las 11 organizaciones sin registro DUA siguen dependiendo de la pregunta P1b de Instrumento 2</w:t>
+            </w:r>
+          </w:p>
+        </w:tc>
+      </w:tr>
+      <w:tr>
+        <w:tc>
+          <w:tcPr>
+            <w:tcW w:type="dxa" w:w="1872"/>
+          </w:tcPr>
+          <w:p>
+            <w:r>
+              <w:t>IV2</w:t>
+            </w:r>
+          </w:p>
+        </w:tc>
+        <w:tc>
+          <w:tcPr>
+            <w:tcW w:type="dxa" w:w="1872"/>
+          </w:tcPr>
+          <w:p>
+            <w:r>
+              <w:t>Exposición regulatoria</w:t>
+            </w:r>
+          </w:p>
+        </w:tc>
+        <w:tc>
+          <w:tcPr>
+            <w:tcW w:type="dxa" w:w="1872"/>
+          </w:tcPr>
+          <w:p>
+            <w:r>
+              <w:t>Ninguna en estas 3 fuentes</w:t>
+            </w:r>
+          </w:p>
+        </w:tc>
+        <w:tc>
+          <w:tcPr>
+            <w:tcW w:type="dxa" w:w="1872"/>
+          </w:tcPr>
+          <w:p>
+            <w:r>
+              <w:t>—</w:t>
+            </w:r>
+          </w:p>
+        </w:tc>
+        <w:tc>
+          <w:tcPr>
+            <w:tcW w:type="dxa" w:w="1872"/>
+          </w:tcPr>
+          <w:p>
+            <w:r>
+              <w:t>Ya resuelta en el diseño con D1 completo — pendiente de aplicar Instrumento 2</w:t>
+            </w:r>
+          </w:p>
+        </w:tc>
+      </w:tr>
+      <w:tr>
+        <w:tc>
+          <w:tcPr>
+            <w:tcW w:type="dxa" w:w="1872"/>
+          </w:tcPr>
+          <w:p>
+            <w:r>
+              <w:t>IV3</w:t>
+            </w:r>
+          </w:p>
+        </w:tc>
+        <w:tc>
+          <w:tcPr>
+            <w:tcW w:type="dxa" w:w="1872"/>
+          </w:tcPr>
+          <w:p>
+            <w:r>
+              <w:t>Fragilidad productiva y territorial</w:t>
+            </w:r>
+          </w:p>
+        </w:tc>
+        <w:tc>
+          <w:tcPr>
+            <w:tcW w:type="dxa" w:w="1872"/>
+          </w:tcPr>
+          <w:p>
+            <w:r>
+              <w:t>Muy parcial (proxy grueso de organización, no de socio)</w:t>
+            </w:r>
+          </w:p>
+        </w:tc>
+        <w:tc>
+          <w:tcPr>
+            <w:tcW w:type="dxa" w:w="1872"/>
+          </w:tcPr>
+          <w:p>
+            <w:r>
+              <w:t>Hectáreas por socio y rango altitudinal declarados a nivel de organización</w:t>
+            </w:r>
+          </w:p>
+        </w:tc>
+        <w:tc>
+          <w:tcPr>
+            <w:tcW w:type="dxa" w:w="1872"/>
+          </w:tcPr>
+          <w:p>
+            <w:r>
+              <w:t>Dispersión geográfica real de los socios — gap ya identificado, pendiente de encuesta</w:t>
+            </w:r>
+          </w:p>
+        </w:tc>
+      </w:tr>
+      <w:tr>
+        <w:tc>
+          <w:tcPr>
+            <w:tcW w:type="dxa" w:w="1872"/>
+          </w:tcPr>
+          <w:p>
+            <w:r>
+              <w:t>IV4</w:t>
+            </w:r>
+          </w:p>
+        </w:tc>
+        <w:tc>
+          <w:tcPr>
+            <w:tcW w:type="dxa" w:w="1872"/>
+          </w:tcPr>
+          <w:p>
+            <w:r>
+              <w:t>Brechas tecnológicas y financieras</w:t>
+            </w:r>
+          </w:p>
+        </w:tc>
+        <w:tc>
+          <w:tcPr>
+            <w:tcW w:type="dxa" w:w="1872"/>
+          </w:tcPr>
+          <w:p>
+            <w:r>
+              <w:t>Ninguna</w:t>
+            </w:r>
+          </w:p>
+        </w:tc>
+        <w:tc>
+          <w:tcPr>
+            <w:tcW w:type="dxa" w:w="1872"/>
+          </w:tcPr>
+          <w:p>
+            <w:r>
+              <w:t>—</w:t>
+            </w:r>
+          </w:p>
+        </w:tc>
+        <w:tc>
+          <w:tcPr>
+            <w:tcW w:type="dxa" w:w="1872"/>
+          </w:tcPr>
+          <w:p>
+            <w:r>
+              <w:t>Conectividad (D6.24) y costo de cumplimiento (D9) — íntegramente Instrumento 2</w:t>
+            </w:r>
+          </w:p>
+        </w:tc>
+      </w:tr>
+      <w:tr>
+        <w:tc>
+          <w:tcPr>
+            <w:tcW w:type="dxa" w:w="1872"/>
+          </w:tcPr>
+          <w:p>
+            <w:r>
+              <w:t>IV5</w:t>
+            </w:r>
+          </w:p>
+        </w:tc>
+        <w:tc>
+          <w:tcPr>
+            <w:tcW w:type="dxa" w:w="1872"/>
+          </w:tcPr>
+          <w:p>
+            <w:r>
+              <w:t>Riesgo social y comercial</w:t>
+            </w:r>
+          </w:p>
+        </w:tc>
+        <w:tc>
+          <w:tcPr>
+            <w:tcW w:type="dxa" w:w="1872"/>
+          </w:tcPr>
+          <w:p>
+            <w:r>
+              <w:t>Señal nueva, sin subdimensión asignada todavía</w:t>
+            </w:r>
+          </w:p>
+        </w:tc>
+        <w:tc>
+          <w:tcPr>
+            <w:tcW w:type="dxa" w:w="1872"/>
+          </w:tcPr>
+          <w:p>
+            <w:r>
+              <w:t>Concentración en un mismo agente de aduana (10 de 13 exportadoras)</w:t>
+            </w:r>
+          </w:p>
+        </w:tc>
+        <w:tc>
+          <w:tcPr>
+            <w:tcW w:type="dxa" w:w="1872"/>
+          </w:tcPr>
+          <w:p>
+            <w:r>
+              <w:t>Pendiente de decisión de alcance explícita (mismo criterio ya aplicado a CLPI en Instrumento 7) antes de incorporarla</w:t>
+            </w:r>
+          </w:p>
+        </w:tc>
+      </w:tr>
+    </w:tbl>
+    <w:p/>
+    <w:p>
+      <w:pPr>
+        <w:spacing w:after="120"/>
+      </w:pPr>
+      <w:r>
+        <w:t>De las diez subdimensiones, dos tienen hoy una fuente externa fuerte en al menos un componente (IP2 por el lado tributario, IV1 para 14 de las 25 organizaciones), cuatro tienen cobertura parcial o un proxy grueso (IP1, IP3, IP4, IV3), y cuatro no tienen ninguna fuente administrativa disponible (IP5, IV2, IV4, y la señal nueva de IV5 sin asignar todavía). Dicho de otro modo: el dato administrativo que ya existe puede acotar o corregir piezas específicas de IP/IV, pero no puede reconstruir la arquitectura completa que el instrumento está diseñado para levantar — la idoneidad preliminar del Instrumento 2 queda, con este ejercicio, más clara en qué resuelve que las fuentes administrativas no resuelven por sí solas.</w:t>
+      </w:r>
+    </w:p>
+    <w:p>
+      <w:pPr>
         <w:pStyle w:val="Ttulo2"/>
         <w:jc w:val="both"/>
         <w:rPr>
@@ -5435,6 +6980,14 @@
     </w:p>
     <w:p>
       <w:pPr>
+        <w:spacing w:after="120"/>
+      </w:pPr>
+      <w:r>
+        <w:t>Un último punto de discusión conecta este ejercicio con el diseño IP/IV de ISCAM. El campo único de avance EUDR autodeclarado que sostiene el índice de la sección 3.2 no puede, por construcción, reconstruir las cinco subdimensiones separables que IP exige: una organización con Art. 9 (geolocalización) resuelto pero Art. 3b (legalidad) pendiente, y otra en la situación inversa, producirían el mismo valor declarado si ambas redondean su propio avance a una sola cifra. Este ejercicio confirma, con los 25 casos documentados, que ese nivel de agregación es insuficiente para el diseño que ISCAM busca —y, a la vez, que un subconjunto específico de variables (inscripción PPA, formalidad SUNAT, FOB por país de destino, Registro Sanitario) sí tiene hoy una fuente externa capaz de auditar las respuestas que Instrumento 2 recoja una vez se aplique a cooperativas reales.</w:t>
+      </w:r>
+    </w:p>
+    <w:p>
+      <w:pPr>
         <w:pStyle w:val="Ttulo2"/>
         <w:jc w:val="both"/>
         <w:rPr>
@@ -5570,6 +7123,14 @@
           <w:rFonts w:ascii="Arial" w:hAnsi="Arial" w:cs="Arial"/>
         </w:rPr>
         <w:t>Tercera, la mayor parte de las correcciones identificadas —completar el campo de avance EUDR, resolver una condición tributaria pendiente, reconciliar el registro interno de ventas con Aduanas— son tareas de gestión administrativa de bajo costo relativo, ejecutables antes de diciembre de 2026 sin inversión adicional en geolocalización satelital. Priorizar estas correcciones en el Tier 2, y mantener un monitoreo mínimo sobre el subconjunto de Tier 3 con experiencia exportadora reciente, parece una asignación de recursos más eficiente que distribuir el acompañamiento técnico de manera uniforme entre las 25 organizaciones.</w:t>
+      </w:r>
+    </w:p>
+    <w:p>
+      <w:pPr>
+        <w:spacing w:after="120"/>
+      </w:pPr>
+      <w:r>
+        <w:t>Cuarta, como ejercicio de factibilidad del instrumento: una sola pregunta autorreportada de avance EUDR es insuficiente para reconstruir las subdimensiones separables que IP/IV requieren, pero existen hoy fuentes administrativas verificables —PPA, SUNAT, Registro Sanitario, y el FOB por país de destino en Aduanas— capaces de auditar externamente un subconjunto específico de las futuras respuestas de Instrumento 2, antes incluso de que la encuesta se aplique a una sola cooperativa real. El mapa de cobertura de la sección 4.11 deja ese subconjunto delimitado con precisión: no sustituye la encuesta, pero acota, desde ahora, qué parte de ella podrá contrastarse externamente y qué parte seguirá dependiendo por completo de lo que cada organización decida reportar.</w:t>
       </w:r>
     </w:p>
     <w:p>

</xml_diff>